<commit_message>
Onboarding note: web search, phone menu hint, troubleshooting row
Co-Authored-By: Claude Sonnet 5.5 <noreply@anthropic.com>
Claude-Session: https://claude.ai/code/session_01Qs56CyPwtQAdyeiDNLqDfK
</commit_message>
<xml_diff>
--- a/docs/family-onboarding.docx
+++ b/docs/family-onboarding.docx
@@ -432,7 +432,27 @@
         <w:t xml:space="preserve">Start a chat: </w:t>
       </w:r>
       <w:r>
-        <w:t xml:space="preserve">tap the pencil icon (new chat), pick a model or assistant at the top, and type.</w:t>
+        <w:t xml:space="preserve">tap the pencil icon (new chat), pick a model or assistant, and type. On a phone, open the menu at the top left first: it holds new chat, search, your chats, and the grid icon for making assistants.</w:t>
+      </w:r>
+    </w:p>
+    <w:p>
+      <w:pPr>
+        <w:pStyle w:val="ListParagraph"/>
+        <w:numPr>
+          <w:ilvl w:val="0"/>
+          <w:numId w:val="2"/>
+        </w:numPr>
+        <w:spacing w:after="60"/>
+      </w:pPr>
+      <w:r>
+        <w:rPr>
+          <w:b/>
+          <w:bCs/>
+        </w:rPr>
+        <w:t xml:space="preserve">Web search: </w:t>
+      </w:r>
+      <w:r>
+        <w:t xml:space="preserve">tap the globe icon in the message box if you want the AI to look something up online. Only the words it searches for go to a search engine, not your whole chat. It is not on every model, and now and then a search comes back empty. If it does, try again in a minute.</w:t>
       </w:r>
     </w:p>
     <w:p>
@@ -575,7 +595,7 @@
         <w:t xml:space="preserve">It stays at home. </w:t>
       </w:r>
       <w:r>
-        <w:t xml:space="preserve">Chats and files are stored on A-M’s computer. At the moment, nothing is sent to outside AI companies. If that changes, A-M will tell everyone first.</w:t>
+        <w:t xml:space="preserve">Chats and files are stored on A-M’s computer, and the AI models run there too. At the moment, nothing is sent to outside AI companies. The one exception is web search: if you switch it on (the globe icon), the words the AI searches for are sent to a search engine, just like a normal web search. Leave it off for anything private. If anything else changes, A-M will tell everyone first.</w:t>
       </w:r>
     </w:p>
     <w:p>
@@ -1058,6 +1078,67 @@
                 <w:sz w:val="21"/>
                 <w:szCs w:val="21"/>
               </w:rPr>
+              <w:t xml:space="preserve">Web search finds nothing or shows an error</w:t>
+            </w:r>
+          </w:p>
+        </w:tc>
+        <w:tc>
+          <w:tcPr>
+            <w:tcW w:type="dxa" w:w="6160"/>
+            <w:tcBorders>
+              <w:top w:val="single" w:color="BBBBBB" w:sz="4"/>
+              <w:left w:val="single" w:color="BBBBBB" w:sz="4"/>
+              <w:bottom w:val="single" w:color="BBBBBB" w:sz="4"/>
+              <w:right w:val="single" w:color="BBBBBB" w:sz="4"/>
+            </w:tcBorders>
+            <w:tcMar>
+              <w:top w:type="dxa" w:w="60"/>
+              <w:left w:type="dxa" w:w="100"/>
+              <w:bottom w:type="dxa" w:w="60"/>
+              <w:right w:type="dxa" w:w="100"/>
+            </w:tcMar>
+          </w:tcPr>
+          <w:p>
+            <w:r>
+              <w:rPr>
+                <w:b w:val="false"/>
+                <w:bCs w:val="false"/>
+                <w:sz w:val="21"/>
+                <w:szCs w:val="21"/>
+              </w:rPr>
+              <w:t xml:space="preserve">Try again in a minute, or ask again with web search switched off. Tell A-M if it keeps happening.</w:t>
+            </w:r>
+          </w:p>
+        </w:tc>
+      </w:tr>
+      <w:tr>
+        <w:trPr>
+          <w:tblHeader w:val="false"/>
+        </w:trPr>
+        <w:tc>
+          <w:tcPr>
+            <w:tcW w:type="dxa" w:w="3200"/>
+            <w:tcBorders>
+              <w:top w:val="single" w:color="BBBBBB" w:sz="4"/>
+              <w:left w:val="single" w:color="BBBBBB" w:sz="4"/>
+              <w:bottom w:val="single" w:color="BBBBBB" w:sz="4"/>
+              <w:right w:val="single" w:color="BBBBBB" w:sz="4"/>
+            </w:tcBorders>
+            <w:tcMar>
+              <w:top w:type="dxa" w:w="60"/>
+              <w:left w:type="dxa" w:w="100"/>
+              <w:bottom w:type="dxa" w:w="60"/>
+              <w:right w:type="dxa" w:w="100"/>
+            </w:tcMar>
+          </w:tcPr>
+          <w:p>
+            <w:r>
+              <w:rPr>
+                <w:b w:val="false"/>
+                <w:bCs w:val="false"/>
+                <w:sz w:val="21"/>
+                <w:szCs w:val="21"/>
+              </w:rPr>
               <w:t xml:space="preserve">The home computer is off or has been restarted</w:t>
             </w:r>
           </w:p>
@@ -1110,7 +1191,7 @@
         <w:spacing w:after="120"/>
       </w:pPr>
       <w:r>
-        <w:t xml:space="preserve">You have a helper called Study Buddy, set up for you. It will help you learn things, check your work and explain tricky topics, and it will give you hints before it gives you answers. You can also make your own assistants, and you are welcome to try the other models.</w:t>
+        <w:t xml:space="preserve">You have a helper called Study Buddy, set up for you. It will help you learn things, check your work and explain tricky topics, and it will give you hints before it gives you answers. You can also make your own assistants, and you are welcome to try the other models. When you tap the globe icon, Study Buddy can look things up online, and it should tell you which websites it used. Check those sources yourself, especially for schoolwork.</w:t>
       </w:r>
     </w:p>
     <w:p>

</xml_diff>